<commit_message>
fix(Docs): update APP_LAUNCH_RUNBOOK for in-app review plugin integration
- Revised the documentation to reflect changes in the native build process, specifying the use of Swift Package Manager instead of CocoaPods for the in-app review plugin.
- Ensured clarity in verification steps for the integration of the review plugin across both iOS and Android platforms.
</commit_message>
<xml_diff>
--- a/docs/operations/APP_LAUNCH_RUNBOOK.docx
+++ b/docs/operations/APP_LAUNCH_RUNBOOK.docx
@@ -426,13 +426,13 @@
         <w:rPr>
           <w:rStyle w:val="VerbatimChar"/>
         </w:rPr>
-        <w:t xml:space="preserve">frontend/ios/App/Podfile.lock</w:t>
-      </w:r>
-      <w:r>
-        <w:t xml:space="preserve"> </w:t>
-      </w:r>
-      <w:r>
-        <w:t xml:space="preserve">and</w:t>
+        <w:t xml:space="preserve">frontend/ios/App/CapApp-SPM/Package.swift</w:t>
+      </w:r>
+      <w:r>
+        <w:t xml:space="preserve"> </w:t>
+      </w:r>
+      <w:r>
+        <w:t xml:space="preserve">(this project uses Swift Package Manager, not CocoaPods) and</w:t>
       </w:r>
       <w:r>
         <w:t xml:space="preserve"> </w:t>
@@ -441,13 +441,13 @@
         <w:rPr>
           <w:rStyle w:val="VerbatimChar"/>
         </w:rPr>
-        <w:t xml:space="preserve">frontend/android</w:t>
-      </w:r>
-      <w:r>
-        <w:t xml:space="preserve"> </w:t>
-      </w:r>
-      <w:r>
-        <w:t xml:space="preserve">reference</w:t>
+        <w:t xml:space="preserve">frontend/android/capacitor.settings.gradle</w:t>
+      </w:r>
+      <w:r>
+        <w:t xml:space="preserve"> </w:t>
+      </w:r>
+      <w:r>
+        <w:t xml:space="preserve">both reference</w:t>
       </w:r>
       <w:r>
         <w:t xml:space="preserve"> </w:t>

</xml_diff>

<commit_message>
docs: update APP_LAUNCH_RUNBOOK with detailed app store optimization steps
- Enhanced the APP_LAUNCH_RUNBOOK documentation to include specific guidelines for app store optimization for both Apple and Google Play, detailing title, description, keywords, and asset requirements.
- Added verification steps for each element to ensure compliance with store submission standards, improving clarity for the deployment process.
</commit_message>
<xml_diff>
--- a/docs/operations/APP_LAUNCH_RUNBOOK.docx
+++ b/docs/operations/APP_LAUNCH_RUNBOOK.docx
@@ -52,7 +52,7 @@
         </w:p>
       </w:sdtContent>
     </w:sdt>
-    <w:bookmarkStart w:id="21" w:name="dealgapiq-app-launch-growth-runbook"/>
+    <w:bookmarkStart w:id="24" w:name="dealgapiq-app-launch-growth-runbook"/>
     <w:p>
       <w:pPr>
         <w:pStyle w:val="Heading1"/>
@@ -1126,7 +1126,7 @@
       </w:r>
     </w:p>
     <w:bookmarkEnd w:id="11"/>
-    <w:bookmarkStart w:id="12" w:name="X8b2e07752da7dc3d0a8c2cc46885d93a6e4fea1"/>
+    <w:bookmarkStart w:id="15" w:name="X8b2e07752da7dc3d0a8c2cc46885d93a6e4fea1"/>
     <w:p>
       <w:pPr>
         <w:pStyle w:val="Heading2"/>
@@ -1140,7 +1140,53 @@
         <w:pStyle w:val="FirstParagraph"/>
       </w:pPr>
       <w:r>
-        <w:t xml:space="preserve">Publish the conversion-optimized listing from the marketing plan.</w:t>
+        <w:rPr>
+          <w:b/>
+          <w:bCs/>
+        </w:rPr>
+        <w:t xml:space="preserve">Source of truth = the asset pack in</w:t>
+      </w:r>
+      <w:r>
+        <w:rPr>
+          <w:b/>
+          <w:bCs/>
+        </w:rPr>
+        <w:t xml:space="preserve"> </w:t>
+      </w:r>
+      <w:r>
+        <w:rPr>
+          <w:rStyle w:val="VerbatimChar"/>
+          <w:b/>
+          <w:bCs/>
+        </w:rPr>
+        <w:t xml:space="preserve">frontend/public/app-store/</w:t>
+      </w:r>
+      <w:r>
+        <w:t xml:space="preserve"> </w:t>
+      </w:r>
+      <w:r>
+        <w:t xml:space="preserve">(already</w:t>
+      </w:r>
+      <w:r>
+        <w:t xml:space="preserve"> </w:t>
+      </w:r>
+      <w:r>
+        <w:t xml:space="preserve">production-ready: 8 ordered screenshots, icon, feature graphics, and finalized</w:t>
+      </w:r>
+      <w:r>
+        <w:t xml:space="preserve"> </w:t>
+      </w:r>
+      <w:r>
+        <w:t xml:space="preserve">copy). All copy below is character-validated. Paste exactly.</w:t>
+      </w:r>
+    </w:p>
+    <w:bookmarkStart w:id="12" w:name="apple-app-store-connect"/>
+    <w:p>
+      <w:pPr>
+        <w:pStyle w:val="Heading3"/>
+      </w:pPr>
+      <w:r>
+        <w:t xml:space="preserve">Apple — App Store Connect</w:t>
       </w:r>
     </w:p>
     <w:p>
@@ -1156,50 +1202,34 @@
           <w:b/>
           <w:bCs/>
         </w:rPr>
-        <w:t xml:space="preserve">Title / Subtitle (Apple):</w:t>
-      </w:r>
-      <w:r>
-        <w:t xml:space="preserve"> </w:t>
-      </w:r>
-      <w:r>
-        <w:rPr>
-          <w:rStyle w:val="VerbatimChar"/>
-        </w:rPr>
-        <w:t xml:space="preserve">DealGapIQ: Property Analysis</w:t>
-      </w:r>
-      <w:r>
-        <w:t xml:space="preserve"> </w:t>
-      </w:r>
-      <w:r>
-        <w:t xml:space="preserve">/</w:t>
-      </w:r>
-      <w:r>
-        <w:t xml:space="preserve"> </w:t>
-      </w:r>
-      <w:r>
-        <w:rPr>
-          <w:rStyle w:val="VerbatimChar"/>
-        </w:rPr>
-        <w:t xml:space="preserve">Score any deal in 60 seconds</w:t>
+        <w:t xml:space="preserve">App Name / Title (≤30):</w:t>
+      </w:r>
+      <w:r>
+        <w:t xml:space="preserve"> </w:t>
+      </w:r>
+      <w:r>
+        <w:rPr>
+          <w:rStyle w:val="VerbatimChar"/>
+        </w:rPr>
+        <w:t xml:space="preserve">DealGapIQ: Real Estate Deals</w:t>
+      </w:r>
+      <w:r>
+        <w:t xml:space="preserve"> </w:t>
+      </w:r>
+      <w:r>
+        <w:t xml:space="preserve">(28). Full rationale + alternates:</w:t>
+      </w:r>
+      <w:r>
+        <w:t xml:space="preserve"> </w:t>
+      </w:r>
+      <w:r>
+        <w:rPr>
+          <w:rStyle w:val="VerbatimChar"/>
+        </w:rPr>
+        <w:t xml:space="preserve">connect/copy/keywords.md</w:t>
       </w:r>
       <w:r>
         <w:t xml:space="preserve">.</w:t>
-      </w:r>
-      <w:r>
-        <w:t xml:space="preserve"> </w:t>
-      </w:r>
-      <w:r>
-        <w:rPr>
-          <w:i/>
-          <w:iCs/>
-        </w:rPr>
-        <w:t xml:space="preserve">Verify:</w:t>
-      </w:r>
-      <w:r>
-        <w:t xml:space="preserve"> </w:t>
-      </w:r>
-      <w:r>
-        <w:t xml:space="preserve">each ≤ 30 chars.</w:t>
       </w:r>
     </w:p>
     <w:p>
@@ -1215,35 +1245,34 @@
           <w:b/>
           <w:bCs/>
         </w:rPr>
-        <w:t xml:space="preserve">Keyword field (Apple, 100 chars):</w:t>
-      </w:r>
-      <w:r>
-        <w:t xml:space="preserve"> </w:t>
-      </w:r>
-      <w:r>
-        <w:rPr>
-          <w:rStyle w:val="VerbatimChar"/>
-        </w:rPr>
-        <w:t xml:space="preserve">rental,flip,brrrr,realestate,investor,roi,cashflow,cap,rate,arv,comps,wholesale,proforma,landlord</w:t>
+        <w:t xml:space="preserve">Subtitle (≤30):</w:t>
+      </w:r>
+      <w:r>
+        <w:t xml:space="preserve"> </w:t>
+      </w:r>
+      <w:r>
+        <w:rPr>
+          <w:rStyle w:val="VerbatimChar"/>
+        </w:rPr>
+        <w:t xml:space="preserve">Every US deal, pre-scored.</w:t>
+      </w:r>
+      <w:r>
+        <w:t xml:space="preserve"> </w:t>
+      </w:r>
+      <w:r>
+        <w:t xml:space="preserve">(26). Source:</w:t>
+      </w:r>
+      <w:r>
+        <w:t xml:space="preserve"> </w:t>
+      </w:r>
+      <w:r>
+        <w:rPr>
+          <w:rStyle w:val="VerbatimChar"/>
+        </w:rPr>
+        <w:t xml:space="preserve">connect/copy/subtitle.md</w:t>
       </w:r>
       <w:r>
         <w:t xml:space="preserve">.</w:t>
-      </w:r>
-      <w:r>
-        <w:t xml:space="preserve"> </w:t>
-      </w:r>
-      <w:r>
-        <w:rPr>
-          <w:i/>
-          <w:iCs/>
-        </w:rPr>
-        <w:t xml:space="preserve">Verify:</w:t>
-      </w:r>
-      <w:r>
-        <w:t xml:space="preserve"> </w:t>
-      </w:r>
-      <w:r>
-        <w:t xml:space="preserve">no spaces after commas; no words repeated from the title.</w:t>
       </w:r>
     </w:p>
     <w:p>
@@ -1259,31 +1288,34 @@
           <w:b/>
           <w:bCs/>
         </w:rPr>
-        <w:t xml:space="preserve">Play title + short description:</w:t>
-      </w:r>
-      <w:r>
-        <w:t xml:space="preserve"> </w:t>
-      </w:r>
-      <w:r>
-        <w:rPr>
-          <w:rStyle w:val="VerbatimChar"/>
-        </w:rPr>
-        <w:t xml:space="preserve">DealGapIQ: Property Analysis</w:t>
-      </w:r>
-      <w:r>
-        <w:t xml:space="preserve"> </w:t>
-      </w:r>
-      <w:r>
-        <w:t xml:space="preserve">/</w:t>
-      </w:r>
-      <w:r>
-        <w:t xml:space="preserve"> </w:t>
-      </w:r>
-      <w:r>
-        <w:rPr>
-          <w:rStyle w:val="VerbatimChar"/>
-        </w:rPr>
-        <w:t xml:space="preserve">Score any rental, flip, or BRRRR deal in 60 seconds. See the Deal Gap instantly.</w:t>
+        <w:t xml:space="preserve">Keyword field (≤100):</w:t>
+      </w:r>
+      <w:r>
+        <w:t xml:space="preserve"> </w:t>
+      </w:r>
+      <w:r>
+        <w:rPr>
+          <w:rStyle w:val="VerbatimChar"/>
+        </w:rPr>
+        <w:t xml:space="preserve">foreclosure,preforeclosure,auction,rental,flip,brrrr,wholesale,investor,roi,cashflow,arv,comps</w:t>
+      </w:r>
+      <w:r>
+        <w:t xml:space="preserve"> </w:t>
+      </w:r>
+      <w:r>
+        <w:t xml:space="preserve">(94). Source:</w:t>
+      </w:r>
+      <w:r>
+        <w:t xml:space="preserve"> </w:t>
+      </w:r>
+      <w:r>
+        <w:rPr>
+          <w:rStyle w:val="VerbatimChar"/>
+        </w:rPr>
+        <w:t xml:space="preserve">connect/copy/keywords.md</w:t>
+      </w:r>
+      <w:r>
+        <w:t xml:space="preserve">.</w:t>
       </w:r>
       <w:r>
         <w:t xml:space="preserve"> </w:t>
@@ -1299,7 +1331,7 @@
         <w:t xml:space="preserve"> </w:t>
       </w:r>
       <w:r>
-        <w:t xml:space="preserve">short description ≤ 80 chars.</w:t>
+        <w:t xml:space="preserve">no spaces after commas.</w:t>
       </w:r>
     </w:p>
     <w:p>
@@ -1315,13 +1347,28 @@
           <w:b/>
           <w:bCs/>
         </w:rPr>
-        <w:t xml:space="preserve">Play long description:</w:t>
-      </w:r>
-      <w:r>
-        <w:t xml:space="preserve"> </w:t>
-      </w:r>
-      <w:r>
-        <w:t xml:space="preserve">publish the keyword-weighted draft (Deal Gap → six strategies → multi-source IQ Estimate → Point &amp; Scan → offer tools → founder authority → pricing).</w:t>
+        <w:t xml:space="preserve">Promotional Text (≤170):</w:t>
+      </w:r>
+      <w:r>
+        <w:t xml:space="preserve"> </w:t>
+      </w:r>
+      <w:r>
+        <w:t xml:space="preserve">see</w:t>
+      </w:r>
+      <w:r>
+        <w:t xml:space="preserve"> </w:t>
+      </w:r>
+      <w:r>
+        <w:rPr>
+          <w:rStyle w:val="VerbatimChar"/>
+        </w:rPr>
+        <w:t xml:space="preserve">connect/copy/promotional-text.md</w:t>
+      </w:r>
+      <w:r>
+        <w:t xml:space="preserve"> </w:t>
+      </w:r>
+      <w:r>
+        <w:t xml:space="preserve">(investor’s-lens primary).</w:t>
       </w:r>
     </w:p>
     <w:p>
@@ -1337,29 +1384,19 @@
           <w:b/>
           <w:bCs/>
         </w:rPr>
-        <w:t xml:space="preserve">Screenshots (6, both stores):</w:t>
-      </w:r>
-      <w:r>
-        <w:t xml:space="preserve"> </w:t>
-      </w:r>
-      <w:r>
-        <w:t xml:space="preserve">Deal Gap verdict → 60-sec multi-strategy → Point &amp; Scan → multi-source IQ Estimate → seller script → founder trust card.</w:t>
-      </w:r>
-      <w:r>
-        <w:t xml:space="preserve"> </w:t>
-      </w:r>
-      <w:r>
-        <w:rPr>
-          <w:i/>
-          <w:iCs/>
-        </w:rPr>
-        <w:t xml:space="preserve">Verify:</w:t>
-      </w:r>
-      <w:r>
-        <w:t xml:space="preserve"> </w:t>
-      </w:r>
-      <w:r>
-        <w:t xml:space="preserve">captions in top third, real numbers, dark UI, portrait 9:16.</w:t>
+        <w:t xml:space="preserve">App Icon:</w:t>
+      </w:r>
+      <w:r>
+        <w:t xml:space="preserve"> </w:t>
+      </w:r>
+      <w:r>
+        <w:rPr>
+          <w:rStyle w:val="VerbatimChar"/>
+        </w:rPr>
+        <w:t xml:space="preserve">connect/icon-1024x1024-v2-fullbleed.png</w:t>
+      </w:r>
+      <w:r>
+        <w:t xml:space="preserve">.</w:t>
       </w:r>
     </w:p>
     <w:p>
@@ -1375,72 +1412,50 @@
           <w:b/>
           <w:bCs/>
         </w:rPr>
-        <w:t xml:space="preserve">Submit for review.</w:t>
-      </w:r>
-      <w:r>
-        <w:t xml:space="preserve"> </w:t>
-      </w:r>
-      <w:r>
-        <w:rPr>
-          <w:i/>
-          <w:iCs/>
-        </w:rPr>
-        <w:t xml:space="preserve">Verify:</w:t>
-      </w:r>
-      <w:r>
-        <w:t xml:space="preserve"> </w:t>
-      </w:r>
-      <w:r>
-        <w:t xml:space="preserve">status =</w:t>
-      </w:r>
-      <w:r>
-        <w:t xml:space="preserve"> </w:t>
-      </w:r>
-      <w:r>
-        <w:t xml:space="preserve">“Waiting for Review”</w:t>
-      </w:r>
-      <w:r>
-        <w:t xml:space="preserve"> </w:t>
-      </w:r>
-      <w:r>
-        <w:t xml:space="preserve">(Apple) /</w:t>
-      </w:r>
-      <w:r>
-        <w:t xml:space="preserve"> </w:t>
-      </w:r>
-      <w:r>
-        <w:t xml:space="preserve">“In review”</w:t>
-      </w:r>
-      <w:r>
-        <w:t xml:space="preserve"> </w:t>
-      </w:r>
-      <w:r>
-        <w:t xml:space="preserve">(Google).</w:t>
-      </w:r>
-    </w:p>
-    <w:p>
-      <w:r>
-        <w:pict>
-          <v:rect style="width:0;height:1.5pt" o:hralign="center" o:hrstd="t" o:hr="t"/>
-        </w:pict>
+        <w:t xml:space="preserve">Screenshots ×8 (6.9”, 1290×2796):</w:t>
+      </w:r>
+      <w:r>
+        <w:t xml:space="preserve"> </w:t>
+      </w:r>
+      <w:r>
+        <w:t xml:space="preserve">upload</w:t>
+      </w:r>
+      <w:r>
+        <w:t xml:space="preserve"> </w:t>
+      </w:r>
+      <w:r>
+        <w:rPr>
+          <w:rStyle w:val="VerbatimChar"/>
+        </w:rPr>
+        <w:t xml:space="preserve">connect/screenshots/01–08-*.png</w:t>
+      </w:r>
+      <w:r>
+        <w:t xml:space="preserve"> </w:t>
+      </w:r>
+      <w:r>
+        <w:t xml:space="preserve">in numbered order. Rationale:</w:t>
+      </w:r>
+      <w:r>
+        <w:t xml:space="preserve"> </w:t>
+      </w:r>
+      <w:r>
+        <w:rPr>
+          <w:rStyle w:val="VerbatimChar"/>
+        </w:rPr>
+        <w:t xml:space="preserve">connect/README.md</w:t>
+      </w:r>
+      <w:r>
+        <w:t xml:space="preserve">.</w:t>
       </w:r>
     </w:p>
     <w:bookmarkEnd w:id="12"/>
-    <w:bookmarkStart w:id="13" w:name="phase-4-seed-reviews-to-2030-weeks-14"/>
-    <w:p>
-      <w:pPr>
-        <w:pStyle w:val="Heading2"/>
-      </w:pPr>
-      <w:r>
-        <w:t xml:space="preserve">Phase 4 — Seed Reviews to 20–30 (Weeks 1–4)</w:t>
-      </w:r>
-    </w:p>
-    <w:p>
-      <w:pPr>
-        <w:pStyle w:val="FirstParagraph"/>
-      </w:pPr>
-      <w:r>
-        <w:t xml:space="preserve">Below ~4.0★ or &lt;10 reviews, both paid and organic conversion are capped. Never incentivize — only prompt people who already love it.</w:t>
+    <w:bookmarkStart w:id="13" w:name="google-play-console"/>
+    <w:p>
+      <w:pPr>
+        <w:pStyle w:val="Heading3"/>
+      </w:pPr>
+      <w:r>
+        <w:t xml:space="preserve">Google Play — Console</w:t>
       </w:r>
     </w:p>
     <w:p>
@@ -1456,13 +1471,19 @@
           <w:b/>
           <w:bCs/>
         </w:rPr>
-        <w:t xml:space="preserve">Verify the in-app prompt fires</w:t>
-      </w:r>
-      <w:r>
-        <w:t xml:space="preserve"> </w:t>
-      </w:r>
-      <w:r>
-        <w:t xml:space="preserve">at the first verdict on a production build.</w:t>
+        <w:t xml:space="preserve">Title (≤30):</w:t>
+      </w:r>
+      <w:r>
+        <w:t xml:space="preserve"> </w:t>
+      </w:r>
+      <w:r>
+        <w:rPr>
+          <w:rStyle w:val="VerbatimChar"/>
+        </w:rPr>
+        <w:t xml:space="preserve">DealGapIQ: Real Estate Deals</w:t>
+      </w:r>
+      <w:r>
+        <w:t xml:space="preserve">.</w:t>
       </w:r>
     </w:p>
     <w:p>
@@ -1478,29 +1499,34 @@
           <w:b/>
           <w:bCs/>
         </w:rPr>
-        <w:t xml:space="preserve">Personally ask the warm base</w:t>
-      </w:r>
-      <w:r>
-        <w:t xml:space="preserve"> </w:t>
-      </w:r>
-      <w:r>
-        <w:t xml:space="preserve">(founder network, beta users, early Pro subscribers) for an honest review — link straight to the store review page.</w:t>
-      </w:r>
-      <w:r>
-        <w:t xml:space="preserve"> </w:t>
-      </w:r>
-      <w:r>
-        <w:rPr>
-          <w:i/>
-          <w:iCs/>
-        </w:rPr>
-        <w:t xml:space="preserve">Do not</w:t>
-      </w:r>
-      <w:r>
-        <w:t xml:space="preserve"> </w:t>
-      </w:r>
-      <w:r>
-        <w:t xml:space="preserve">offer rewards.</w:t>
+        <w:t xml:space="preserve">Short description (≤80):</w:t>
+      </w:r>
+      <w:r>
+        <w:t xml:space="preserve"> </w:t>
+      </w:r>
+      <w:r>
+        <w:rPr>
+          <w:rStyle w:val="VerbatimChar"/>
+        </w:rPr>
+        <w:t xml:space="preserve">Every US listing pre-scored DEAL, MAYBE or PASS. See the Deal Gap in seconds.</w:t>
+      </w:r>
+      <w:r>
+        <w:t xml:space="preserve"> </w:t>
+      </w:r>
+      <w:r>
+        <w:t xml:space="preserve">(77). Source:</w:t>
+      </w:r>
+      <w:r>
+        <w:t xml:space="preserve"> </w:t>
+      </w:r>
+      <w:r>
+        <w:rPr>
+          <w:rStyle w:val="VerbatimChar"/>
+        </w:rPr>
+        <w:t xml:space="preserve">play-store/copy/description.md</w:t>
+      </w:r>
+      <w:r>
+        <w:t xml:space="preserve">.</w:t>
       </w:r>
     </w:p>
     <w:p>
@@ -1516,54 +1542,28 @@
           <w:b/>
           <w:bCs/>
         </w:rPr>
-        <w:t xml:space="preserve">Velocity target:</w:t>
-      </w:r>
-      <w:r>
-        <w:t xml:space="preserve"> </w:t>
-      </w:r>
-      <w:r>
-        <w:t xml:space="preserve">5–8 reviews/week for 4 weeks → 20–30 total.</w:t>
-      </w:r>
-      <w:r>
-        <w:t xml:space="preserve"> </w:t>
-      </w:r>
-      <w:r>
-        <w:rPr>
-          <w:i/>
-          <w:iCs/>
-        </w:rPr>
-        <w:t xml:space="preserve">Verify:</w:t>
-      </w:r>
-      <w:r>
-        <w:t xml:space="preserve"> </w:t>
-      </w:r>
-      <w:r>
-        <w:t xml:space="preserve">rating ≥ 4.0★ before scaling paid.</w:t>
-      </w:r>
-    </w:p>
-    <w:p>
-      <w:r>
-        <w:pict>
-          <v:rect style="width:0;height:1.5pt" o:hralign="center" o:hrstd="t" o:hr="t"/>
-        </w:pict>
-      </w:r>
-    </w:p>
-    <w:bookmarkEnd w:id="13"/>
-    <w:bookmarkStart w:id="14" w:name="X0d464b808eb42f2d46236f07d28f9574cc8f44f"/>
-    <w:p>
-      <w:pPr>
-        <w:pStyle w:val="Heading2"/>
-      </w:pPr>
-      <w:r>
-        <w:t xml:space="preserve">Phase 5 — Activate Organic Channels (Week 1, ongoing)</w:t>
-      </w:r>
-    </w:p>
-    <w:p>
-      <w:pPr>
-        <w:pStyle w:val="FirstParagraph"/>
-      </w:pPr>
-      <w:r>
-        <w:t xml:space="preserve">Point the founder’s owned reach (LinkedIn, YouTube, podcasts) at the app — the highest-trust, zero-CAC channel.</w:t>
+        <w:t xml:space="preserve">Full description (≤4000):</w:t>
+      </w:r>
+      <w:r>
+        <w:t xml:space="preserve"> </w:t>
+      </w:r>
+      <w:r>
+        <w:t xml:space="preserve">paste from</w:t>
+      </w:r>
+      <w:r>
+        <w:t xml:space="preserve"> </w:t>
+      </w:r>
+      <w:r>
+        <w:rPr>
+          <w:rStyle w:val="VerbatimChar"/>
+        </w:rPr>
+        <w:t xml:space="preserve">play-store/copy/description.md</w:t>
+      </w:r>
+      <w:r>
+        <w:t xml:space="preserve"> </w:t>
+      </w:r>
+      <w:r>
+        <w:t xml:space="preserve">(keyword-weighted; pricing $34.99 / $349.99).</w:t>
       </w:r>
     </w:p>
     <w:p>
@@ -1579,72 +1579,44 @@
           <w:b/>
           <w:bCs/>
         </w:rPr>
-        <w:t xml:space="preserve">Standardize the CTA</w:t>
-      </w:r>
-      <w:r>
-        <w:t xml:space="preserve"> </w:t>
-      </w:r>
-      <w:r>
-        <w:t xml:space="preserve">on every channel:</w:t>
-      </w:r>
-      <w:r>
-        <w:t xml:space="preserve"> </w:t>
-      </w:r>
-      <w:r>
-        <w:rPr>
-          <w:i/>
-          <w:iCs/>
-        </w:rPr>
-        <w:t xml:space="preserve">“Score any property in 60 seconds, free — get it at dealgapiq.com or search</w:t>
-      </w:r>
-      <w:r>
-        <w:rPr>
-          <w:i/>
-          <w:iCs/>
-        </w:rPr>
-        <w:t xml:space="preserve"> </w:t>
-      </w:r>
-      <w:r>
-        <w:rPr>
-          <w:i/>
-          <w:iCs/>
-        </w:rPr>
-        <w:t xml:space="preserve">‘DealGapIQ’</w:t>
-      </w:r>
-      <w:r>
-        <w:rPr>
-          <w:i/>
-          <w:iCs/>
-        </w:rPr>
-        <w:t xml:space="preserve"> </w:t>
-      </w:r>
-      <w:r>
-        <w:rPr>
-          <w:i/>
-          <w:iCs/>
-        </w:rPr>
-        <w:t xml:space="preserve">in the App Store.”</w:t>
-      </w:r>
-      <w:r>
-        <w:t xml:space="preserve"> </w:t>
-      </w:r>
-      <w:r>
-        <w:t xml:space="preserve">(Link to</w:t>
-      </w:r>
-      <w:r>
-        <w:t xml:space="preserve"> </w:t>
-      </w:r>
-      <w:r>
-        <w:rPr>
-          <w:rStyle w:val="VerbatimChar"/>
-        </w:rPr>
-        <w:t xml:space="preserve">/get-app</w:t>
-      </w:r>
-      <w:r>
-        <w:t xml:space="preserve"> </w:t>
-      </w:r>
-      <w:r>
-        <w:t xml:space="preserve">on web; the smart banner/redirect handles mobile.)</w:t>
+        <w:t xml:space="preserve">Feature graphic (1024×500):</w:t>
+      </w:r>
+      <w:r>
+        <w:t xml:space="preserve"> </w:t>
+      </w:r>
+      <w:r>
+        <w:rPr>
+          <w:rStyle w:val="VerbatimChar"/>
+        </w:rPr>
+        <w:t xml:space="preserve">play-store/feature-graphic-1024x500-v5-discover-deals.png</w:t>
+      </w:r>
+      <w:r>
+        <w:t xml:space="preserve"> </w:t>
+      </w:r>
+      <w:r>
+        <w:t xml:space="preserve">(remove old promo video or recut — see</w:t>
+      </w:r>
+      <w:r>
+        <w:t xml:space="preserve"> </w:t>
+      </w:r>
+      <w:r>
+        <w:rPr>
+          <w:rStyle w:val="VerbatimChar"/>
+        </w:rPr>
+        <w:t xml:space="preserve">play-store/README.md</w:t>
+      </w:r>
+      <w:r>
+        <w:t xml:space="preserve">).</w:t>
+      </w:r>
+    </w:p>
+    <w:bookmarkEnd w:id="13"/>
+    <w:bookmarkStart w:id="14" w:name="both-stores"/>
+    <w:p>
+      <w:pPr>
+        <w:pStyle w:val="Heading3"/>
+      </w:pPr>
+      <w:r>
+        <w:t xml:space="preserve">Both stores</w:t>
       </w:r>
     </w:p>
     <w:p>
@@ -1660,23 +1632,25 @@
           <w:b/>
           <w:bCs/>
         </w:rPr>
-        <w:t xml:space="preserve">Add the authority signature</w:t>
-      </w:r>
-      <w:r>
-        <w:t xml:space="preserve"> </w:t>
-      </w:r>
-      <w:r>
-        <w:t xml:space="preserve">to every bio/first comment:</w:t>
-      </w:r>
-      <w:r>
-        <w:t xml:space="preserve"> </w:t>
-      </w:r>
-      <w:r>
-        <w:rPr>
-          <w:i/>
-          <w:iCs/>
-        </w:rPr>
-        <w:t xml:space="preserve">“Brad Geisen — Founder of Foreclosure.com; built HomePath.com for Fannie Mae and HomeSteps.com for Freddie Mac.”</w:t>
+        <w:t xml:space="preserve">App Preview video (optional, high impact):</w:t>
+      </w:r>
+      <w:r>
+        <w:t xml:space="preserve"> </w:t>
+      </w:r>
+      <w:r>
+        <w:t xml:space="preserve">produce per</w:t>
+      </w:r>
+      <w:r>
+        <w:t xml:space="preserve"> </w:t>
+      </w:r>
+      <w:r>
+        <w:rPr>
+          <w:rStyle w:val="VerbatimChar"/>
+        </w:rPr>
+        <w:t xml:space="preserve">connect/copy/app-preview-video-brief.md</w:t>
+      </w:r>
+      <w:r>
+        <w:t xml:space="preserve">.</w:t>
       </w:r>
     </w:p>
     <w:p>
@@ -1692,13 +1666,40 @@
           <w:b/>
           <w:bCs/>
         </w:rPr>
-        <w:t xml:space="preserve">Publish on cadence:</w:t>
-      </w:r>
-      <w:r>
-        <w:t xml:space="preserve"> </w:t>
-      </w:r>
-      <w:r>
-        <w:t xml:space="preserve">3 LinkedIn / 1 YouTube / 1 podcast-or-repurpose per week, each built around a real (anonymized) Deal Gap example.</w:t>
+        <w:t xml:space="preserve">Generate the in-app icon size variants</w:t>
+      </w:r>
+      <w:r>
+        <w:t xml:space="preserve"> </w:t>
+      </w:r>
+      <w:r>
+        <w:t xml:space="preserve">from the 1024 icon and replace in the Xcode</w:t>
+      </w:r>
+      <w:r>
+        <w:t xml:space="preserve"> </w:t>
+      </w:r>
+      <w:r>
+        <w:rPr>
+          <w:rStyle w:val="VerbatimChar"/>
+        </w:rPr>
+        <w:t xml:space="preserve">AppIcon.appiconset</w:t>
+      </w:r>
+      <w:r>
+        <w:t xml:space="preserve"> </w:t>
+      </w:r>
+      <w:r>
+        <w:t xml:space="preserve">(so the home-screen icon matches the listing — see</w:t>
+      </w:r>
+      <w:r>
+        <w:t xml:space="preserve"> </w:t>
+      </w:r>
+      <w:r>
+        <w:rPr>
+          <w:rStyle w:val="VerbatimChar"/>
+        </w:rPr>
+        <w:t xml:space="preserve">connect/README.md</w:t>
+      </w:r>
+      <w:r>
+        <w:t xml:space="preserve">).</w:t>
       </w:r>
     </w:p>
     <w:p>
@@ -1711,6 +1712,16 @@
       </w:pPr>
       <w:r>
         <w:rPr>
+          <w:b/>
+          <w:bCs/>
+        </w:rPr>
+        <w:t xml:space="preserve">Submit for review.</w:t>
+      </w:r>
+      <w:r>
+        <w:t xml:space="preserve"> </w:t>
+      </w:r>
+      <w:r>
+        <w:rPr>
           <w:i/>
           <w:iCs/>
         </w:rPr>
@@ -1720,31 +1731,31 @@
         <w:t xml:space="preserve"> </w:t>
       </w:r>
       <w:r>
-        <w:rPr>
-          <w:rStyle w:val="VerbatimChar"/>
-        </w:rPr>
-        <w:t xml:space="preserve">get_app_clicked</w:t>
-      </w:r>
-      <w:r>
-        <w:t xml:space="preserve"> </w:t>
-      </w:r>
-      <w:r>
-        <w:t xml:space="preserve">events show inbound traffic from owned channels (use</w:t>
-      </w:r>
-      <w:r>
-        <w:t xml:space="preserve"> </w:t>
-      </w:r>
-      <w:r>
-        <w:rPr>
-          <w:rStyle w:val="VerbatimChar"/>
-        </w:rPr>
-        <w:t xml:space="preserve">?utm_source=</w:t>
-      </w:r>
-      <w:r>
-        <w:t xml:space="preserve"> </w:t>
-      </w:r>
-      <w:r>
-        <w:t xml:space="preserve">links).</w:t>
+        <w:t xml:space="preserve">status =</w:t>
+      </w:r>
+      <w:r>
+        <w:t xml:space="preserve"> </w:t>
+      </w:r>
+      <w:r>
+        <w:t xml:space="preserve">“Waiting for Review”</w:t>
+      </w:r>
+      <w:r>
+        <w:t xml:space="preserve"> </w:t>
+      </w:r>
+      <w:r>
+        <w:t xml:space="preserve">(Apple) /</w:t>
+      </w:r>
+      <w:r>
+        <w:t xml:space="preserve"> </w:t>
+      </w:r>
+      <w:r>
+        <w:t xml:space="preserve">“In review”</w:t>
+      </w:r>
+      <w:r>
+        <w:t xml:space="preserve"> </w:t>
+      </w:r>
+      <w:r>
+        <w:t xml:space="preserve">(Google).</w:t>
       </w:r>
     </w:p>
     <w:p>
@@ -1755,13 +1766,14 @@
       </w:r>
     </w:p>
     <w:bookmarkEnd w:id="14"/>
-    <w:bookmarkStart w:id="15" w:name="Xef0aa3901cd581c7979f4a690749c3197a4cd4e"/>
+    <w:bookmarkEnd w:id="15"/>
+    <w:bookmarkStart w:id="16" w:name="phase-4-seed-reviews-to-2030-weeks-14"/>
     <w:p>
       <w:pPr>
         <w:pStyle w:val="Heading2"/>
       </w:pPr>
       <w:r>
-        <w:t xml:space="preserve">Phase 6 — Launch Paid Acquisition (Week 2+, gated)</w:t>
+        <w:t xml:space="preserve">Phase 4 — Seed Reviews to 20–30 (Weeks 1–4)</w:t>
       </w:r>
     </w:p>
     <w:p>
@@ -1769,17 +1781,7 @@
         <w:pStyle w:val="FirstParagraph"/>
       </w:pPr>
       <w:r>
-        <w:rPr>
-          <w:b/>
-          <w:bCs/>
-        </w:rPr>
-        <w:t xml:space="preserve">Gate:</w:t>
-      </w:r>
-      <w:r>
-        <w:t xml:space="preserve"> </w:t>
-      </w:r>
-      <w:r>
-        <w:t xml:space="preserve">do not scale paid until new screenshots are live AND rating ≥ 10 reviews / ≥ 4.0★. Run discovery-budget only until then.</w:t>
+        <w:t xml:space="preserve">Below ~4.0★ or &lt;10 reviews, both paid and organic conversion are capped. Never incentivize — only prompt people who already love it.</w:t>
       </w:r>
     </w:p>
     <w:p>
@@ -1795,29 +1797,13 @@
           <w:b/>
           <w:bCs/>
         </w:rPr>
-        <w:t xml:space="preserve">Apple Search Ads</w:t>
-      </w:r>
-      <w:r>
-        <w:t xml:space="preserve"> </w:t>
-      </w:r>
-      <w:r>
-        <w:t xml:space="preserve">(~$45/day total): Brand defense $5, Core discovery $20, Competitor conquesting $10, Search Match $10. Use a Custom Product Page with the Deal-Gap-led screenshot.</w:t>
-      </w:r>
-      <w:r>
-        <w:t xml:space="preserve"> </w:t>
-      </w:r>
-      <w:r>
-        <w:rPr>
-          <w:i/>
-          <w:iCs/>
-        </w:rPr>
-        <w:t xml:space="preserve">Verify:</w:t>
-      </w:r>
-      <w:r>
-        <w:t xml:space="preserve"> </w:t>
-      </w:r>
-      <w:r>
-        <w:t xml:space="preserve">CPI tracked per keyword.</w:t>
+        <w:t xml:space="preserve">Verify the in-app prompt fires</w:t>
+      </w:r>
+      <w:r>
+        <w:t xml:space="preserve"> </w:t>
+      </w:r>
+      <w:r>
+        <w:t xml:space="preserve">at the first verdict on a production build.</w:t>
       </w:r>
     </w:p>
     <w:p>
@@ -1833,25 +1819,13 @@
           <w:b/>
           <w:bCs/>
         </w:rPr>
-        <w:t xml:space="preserve">Google App Campaign</w:t>
-      </w:r>
-      <w:r>
-        <w:t xml:space="preserve"> </w:t>
-      </w:r>
-      <w:r>
-        <w:t xml:space="preserve">($25/day): supply 5 headlines, 5 descriptions, 6 screenshots, 1 portrait video, the icon. Switch bid goal to</w:t>
-      </w:r>
-      <w:r>
-        <w:t xml:space="preserve"> </w:t>
-      </w:r>
-      <w:r>
-        <w:t xml:space="preserve">“first analysis completed”</w:t>
-      </w:r>
-      <w:r>
-        <w:t xml:space="preserve"> </w:t>
-      </w:r>
-      <w:r>
-        <w:t xml:space="preserve">after ~30 installs.</w:t>
+        <w:t xml:space="preserve">Personally ask the warm base</w:t>
+      </w:r>
+      <w:r>
+        <w:t xml:space="preserve"> </w:t>
+      </w:r>
+      <w:r>
+        <w:t xml:space="preserve">(founder network, beta users, early Pro subscribers) for an honest review — link straight to the store review page.</w:t>
       </w:r>
       <w:r>
         <w:t xml:space="preserve"> </w:t>
@@ -1861,13 +1835,13 @@
           <w:i/>
           <w:iCs/>
         </w:rPr>
-        <w:t xml:space="preserve">Verify:</w:t>
-      </w:r>
-      <w:r>
-        <w:t xml:space="preserve"> </w:t>
-      </w:r>
-      <w:r>
-        <w:t xml:space="preserve">assets approved, campaign serving.</w:t>
+        <w:t xml:space="preserve">Do not</w:t>
+      </w:r>
+      <w:r>
+        <w:t xml:space="preserve"> </w:t>
+      </w:r>
+      <w:r>
+        <w:t xml:space="preserve">offer rewards.</w:t>
       </w:r>
     </w:p>
     <w:p>
@@ -1883,13 +1857,29 @@
           <w:b/>
           <w:bCs/>
         </w:rPr>
-        <w:t xml:space="preserve">Apply guardrails:</w:t>
-      </w:r>
-      <w:r>
-        <w:t xml:space="preserve"> </w:t>
-      </w:r>
-      <w:r>
-        <w:t xml:space="preserve">pause any keyword &gt; $8 CPI or &gt; $60 cost-per-trial at the 7-day read; reallocate to winners.</w:t>
+        <w:t xml:space="preserve">Velocity target:</w:t>
+      </w:r>
+      <w:r>
+        <w:t xml:space="preserve"> </w:t>
+      </w:r>
+      <w:r>
+        <w:t xml:space="preserve">5–8 reviews/week for 4 weeks → 20–30 total.</w:t>
+      </w:r>
+      <w:r>
+        <w:t xml:space="preserve"> </w:t>
+      </w:r>
+      <w:r>
+        <w:rPr>
+          <w:i/>
+          <w:iCs/>
+        </w:rPr>
+        <w:t xml:space="preserve">Verify:</w:t>
+      </w:r>
+      <w:r>
+        <w:t xml:space="preserve"> </w:t>
+      </w:r>
+      <w:r>
+        <w:t xml:space="preserve">rating ≥ 4.0★ before scaling paid.</w:t>
       </w:r>
     </w:p>
     <w:p>
@@ -1899,17 +1889,368 @@
         </w:pict>
       </w:r>
     </w:p>
-    <w:bookmarkEnd w:id="15"/>
-    <w:bookmarkStart w:id="18" w:name="phase-7-track-optimize-weekly-ongoing"/>
+    <w:bookmarkEnd w:id="16"/>
+    <w:bookmarkStart w:id="17" w:name="X0d464b808eb42f2d46236f07d28f9574cc8f44f"/>
     <w:p>
       <w:pPr>
         <w:pStyle w:val="Heading2"/>
       </w:pPr>
       <w:r>
+        <w:t xml:space="preserve">Phase 5 — Activate Organic Channels (Week 1, ongoing)</w:t>
+      </w:r>
+    </w:p>
+    <w:p>
+      <w:pPr>
+        <w:pStyle w:val="FirstParagraph"/>
+      </w:pPr>
+      <w:r>
+        <w:t xml:space="preserve">Point the founder’s owned reach (LinkedIn, YouTube, podcasts) at the app — the highest-trust, zero-CAC channel.</w:t>
+      </w:r>
+    </w:p>
+    <w:p>
+      <w:pPr>
+        <w:pStyle w:val="Compact"/>
+        <w:numPr>
+          <w:ilvl w:val="0"/>
+          <w:numId w:val="1032"/>
+        </w:numPr>
+      </w:pPr>
+      <w:r>
+        <w:rPr>
+          <w:b/>
+          <w:bCs/>
+        </w:rPr>
+        <w:t xml:space="preserve">Standardize the CTA</w:t>
+      </w:r>
+      <w:r>
+        <w:t xml:space="preserve"> </w:t>
+      </w:r>
+      <w:r>
+        <w:t xml:space="preserve">on every channel:</w:t>
+      </w:r>
+      <w:r>
+        <w:t xml:space="preserve"> </w:t>
+      </w:r>
+      <w:r>
+        <w:rPr>
+          <w:i/>
+          <w:iCs/>
+        </w:rPr>
+        <w:t xml:space="preserve">“Score any property in 60 seconds, free — get it at dealgapiq.com or search</w:t>
+      </w:r>
+      <w:r>
+        <w:rPr>
+          <w:i/>
+          <w:iCs/>
+        </w:rPr>
+        <w:t xml:space="preserve"> </w:t>
+      </w:r>
+      <w:r>
+        <w:rPr>
+          <w:i/>
+          <w:iCs/>
+        </w:rPr>
+        <w:t xml:space="preserve">‘DealGapIQ’</w:t>
+      </w:r>
+      <w:r>
+        <w:rPr>
+          <w:i/>
+          <w:iCs/>
+        </w:rPr>
+        <w:t xml:space="preserve"> </w:t>
+      </w:r>
+      <w:r>
+        <w:rPr>
+          <w:i/>
+          <w:iCs/>
+        </w:rPr>
+        <w:t xml:space="preserve">in the App Store.”</w:t>
+      </w:r>
+      <w:r>
+        <w:t xml:space="preserve"> </w:t>
+      </w:r>
+      <w:r>
+        <w:t xml:space="preserve">(Link to</w:t>
+      </w:r>
+      <w:r>
+        <w:t xml:space="preserve"> </w:t>
+      </w:r>
+      <w:r>
+        <w:rPr>
+          <w:rStyle w:val="VerbatimChar"/>
+        </w:rPr>
+        <w:t xml:space="preserve">/get-app</w:t>
+      </w:r>
+      <w:r>
+        <w:t xml:space="preserve"> </w:t>
+      </w:r>
+      <w:r>
+        <w:t xml:space="preserve">on web; the smart banner/redirect handles mobile.)</w:t>
+      </w:r>
+    </w:p>
+    <w:p>
+      <w:pPr>
+        <w:pStyle w:val="Compact"/>
+        <w:numPr>
+          <w:ilvl w:val="0"/>
+          <w:numId w:val="1033"/>
+        </w:numPr>
+      </w:pPr>
+      <w:r>
+        <w:rPr>
+          <w:b/>
+          <w:bCs/>
+        </w:rPr>
+        <w:t xml:space="preserve">Add the authority signature</w:t>
+      </w:r>
+      <w:r>
+        <w:t xml:space="preserve"> </w:t>
+      </w:r>
+      <w:r>
+        <w:t xml:space="preserve">to every bio/first comment:</w:t>
+      </w:r>
+      <w:r>
+        <w:t xml:space="preserve"> </w:t>
+      </w:r>
+      <w:r>
+        <w:rPr>
+          <w:i/>
+          <w:iCs/>
+        </w:rPr>
+        <w:t xml:space="preserve">“Brad Geisen — Founder of Foreclosure.com; built HomePath.com for Fannie Mae and HomeSteps.com for Freddie Mac.”</w:t>
+      </w:r>
+    </w:p>
+    <w:p>
+      <w:pPr>
+        <w:pStyle w:val="Compact"/>
+        <w:numPr>
+          <w:ilvl w:val="0"/>
+          <w:numId w:val="1034"/>
+        </w:numPr>
+      </w:pPr>
+      <w:r>
+        <w:rPr>
+          <w:b/>
+          <w:bCs/>
+        </w:rPr>
+        <w:t xml:space="preserve">Publish on cadence:</w:t>
+      </w:r>
+      <w:r>
+        <w:t xml:space="preserve"> </w:t>
+      </w:r>
+      <w:r>
+        <w:t xml:space="preserve">3 LinkedIn / 1 YouTube / 1 podcast-or-repurpose per week, each built around a real (anonymized) Deal Gap example.</w:t>
+      </w:r>
+    </w:p>
+    <w:p>
+      <w:pPr>
+        <w:pStyle w:val="Compact"/>
+        <w:numPr>
+          <w:ilvl w:val="0"/>
+          <w:numId w:val="1035"/>
+        </w:numPr>
+      </w:pPr>
+      <w:r>
+        <w:rPr>
+          <w:i/>
+          <w:iCs/>
+        </w:rPr>
+        <w:t xml:space="preserve">Verify:</w:t>
+      </w:r>
+      <w:r>
+        <w:t xml:space="preserve"> </w:t>
+      </w:r>
+      <w:r>
+        <w:rPr>
+          <w:rStyle w:val="VerbatimChar"/>
+        </w:rPr>
+        <w:t xml:space="preserve">get_app_clicked</w:t>
+      </w:r>
+      <w:r>
+        <w:t xml:space="preserve"> </w:t>
+      </w:r>
+      <w:r>
+        <w:t xml:space="preserve">events show inbound traffic from owned channels (use</w:t>
+      </w:r>
+      <w:r>
+        <w:t xml:space="preserve"> </w:t>
+      </w:r>
+      <w:r>
+        <w:rPr>
+          <w:rStyle w:val="VerbatimChar"/>
+        </w:rPr>
+        <w:t xml:space="preserve">?utm_source=</w:t>
+      </w:r>
+      <w:r>
+        <w:t xml:space="preserve"> </w:t>
+      </w:r>
+      <w:r>
+        <w:t xml:space="preserve">links).</w:t>
+      </w:r>
+    </w:p>
+    <w:p>
+      <w:r>
+        <w:pict>
+          <v:rect style="width:0;height:1.5pt" o:hralign="center" o:hrstd="t" o:hr="t"/>
+        </w:pict>
+      </w:r>
+    </w:p>
+    <w:bookmarkEnd w:id="17"/>
+    <w:bookmarkStart w:id="18" w:name="Xef0aa3901cd581c7979f4a690749c3197a4cd4e"/>
+    <w:p>
+      <w:pPr>
+        <w:pStyle w:val="Heading2"/>
+      </w:pPr>
+      <w:r>
+        <w:t xml:space="preserve">Phase 6 — Launch Paid Acquisition (Week 2+, gated)</w:t>
+      </w:r>
+    </w:p>
+    <w:p>
+      <w:pPr>
+        <w:pStyle w:val="FirstParagraph"/>
+      </w:pPr>
+      <w:r>
+        <w:rPr>
+          <w:b/>
+          <w:bCs/>
+        </w:rPr>
+        <w:t xml:space="preserve">Gate:</w:t>
+      </w:r>
+      <w:r>
+        <w:t xml:space="preserve"> </w:t>
+      </w:r>
+      <w:r>
+        <w:t xml:space="preserve">do not scale paid until new screenshots are live AND rating ≥ 10 reviews / ≥ 4.0★. Run discovery-budget only until then.</w:t>
+      </w:r>
+    </w:p>
+    <w:p>
+      <w:pPr>
+        <w:pStyle w:val="Compact"/>
+        <w:numPr>
+          <w:ilvl w:val="0"/>
+          <w:numId w:val="1036"/>
+        </w:numPr>
+      </w:pPr>
+      <w:r>
+        <w:rPr>
+          <w:b/>
+          <w:bCs/>
+        </w:rPr>
+        <w:t xml:space="preserve">Apple Search Ads</w:t>
+      </w:r>
+      <w:r>
+        <w:t xml:space="preserve"> </w:t>
+      </w:r>
+      <w:r>
+        <w:t xml:space="preserve">(~$45/day total): Brand defense $5, Core discovery $20, Competitor conquesting $10, Search Match $10. Use a Custom Product Page with the Deal-Gap-led screenshot.</w:t>
+      </w:r>
+      <w:r>
+        <w:t xml:space="preserve"> </w:t>
+      </w:r>
+      <w:r>
+        <w:rPr>
+          <w:i/>
+          <w:iCs/>
+        </w:rPr>
+        <w:t xml:space="preserve">Verify:</w:t>
+      </w:r>
+      <w:r>
+        <w:t xml:space="preserve"> </w:t>
+      </w:r>
+      <w:r>
+        <w:t xml:space="preserve">CPI tracked per keyword.</w:t>
+      </w:r>
+    </w:p>
+    <w:p>
+      <w:pPr>
+        <w:pStyle w:val="Compact"/>
+        <w:numPr>
+          <w:ilvl w:val="0"/>
+          <w:numId w:val="1037"/>
+        </w:numPr>
+      </w:pPr>
+      <w:r>
+        <w:rPr>
+          <w:b/>
+          <w:bCs/>
+        </w:rPr>
+        <w:t xml:space="preserve">Google App Campaign</w:t>
+      </w:r>
+      <w:r>
+        <w:t xml:space="preserve"> </w:t>
+      </w:r>
+      <w:r>
+        <w:t xml:space="preserve">($25/day): supply 5 headlines, 5 descriptions, 6 screenshots, 1 portrait video, the icon. Switch bid goal to</w:t>
+      </w:r>
+      <w:r>
+        <w:t xml:space="preserve"> </w:t>
+      </w:r>
+      <w:r>
+        <w:t xml:space="preserve">“first analysis completed”</w:t>
+      </w:r>
+      <w:r>
+        <w:t xml:space="preserve"> </w:t>
+      </w:r>
+      <w:r>
+        <w:t xml:space="preserve">after ~30 installs.</w:t>
+      </w:r>
+      <w:r>
+        <w:t xml:space="preserve"> </w:t>
+      </w:r>
+      <w:r>
+        <w:rPr>
+          <w:i/>
+          <w:iCs/>
+        </w:rPr>
+        <w:t xml:space="preserve">Verify:</w:t>
+      </w:r>
+      <w:r>
+        <w:t xml:space="preserve"> </w:t>
+      </w:r>
+      <w:r>
+        <w:t xml:space="preserve">assets approved, campaign serving.</w:t>
+      </w:r>
+    </w:p>
+    <w:p>
+      <w:pPr>
+        <w:pStyle w:val="Compact"/>
+        <w:numPr>
+          <w:ilvl w:val="0"/>
+          <w:numId w:val="1038"/>
+        </w:numPr>
+      </w:pPr>
+      <w:r>
+        <w:rPr>
+          <w:b/>
+          <w:bCs/>
+        </w:rPr>
+        <w:t xml:space="preserve">Apply guardrails:</w:t>
+      </w:r>
+      <w:r>
+        <w:t xml:space="preserve"> </w:t>
+      </w:r>
+      <w:r>
+        <w:t xml:space="preserve">pause any keyword &gt; $8 CPI or &gt; $60 cost-per-trial at the 7-day read; reallocate to winners.</w:t>
+      </w:r>
+    </w:p>
+    <w:p>
+      <w:r>
+        <w:pict>
+          <v:rect style="width:0;height:1.5pt" o:hralign="center" o:hrstd="t" o:hr="t"/>
+        </w:pict>
+      </w:r>
+    </w:p>
+    <w:bookmarkEnd w:id="18"/>
+    <w:bookmarkStart w:id="21" w:name="phase-7-track-optimize-weekly-ongoing"/>
+    <w:p>
+      <w:pPr>
+        <w:pStyle w:val="Heading2"/>
+      </w:pPr>
+      <w:r>
         <w:t xml:space="preserve">Phase 7 — Track &amp; Optimize (Weekly, ongoing)</w:t>
       </w:r>
     </w:p>
-    <w:bookmarkStart w:id="16" w:name="kpi-dashboard"/>
+    <w:bookmarkStart w:id="19" w:name="kpi-dashboard"/>
     <w:p>
       <w:pPr>
         <w:pStyle w:val="Heading3"/>
@@ -2267,8 +2608,8 @@
         </w:tc>
       </w:tr>
     </w:tbl>
-    <w:bookmarkEnd w:id="16"/>
-    <w:bookmarkStart w:id="17" w:name="weekly-loop-every-monday-30-min"/>
+    <w:bookmarkEnd w:id="19"/>
+    <w:bookmarkStart w:id="20" w:name="weekly-loop-every-monday-30-min"/>
     <w:p>
       <w:pPr>
         <w:pStyle w:val="Heading3"/>
@@ -2282,7 +2623,7 @@
         <w:pStyle w:val="Compact"/>
         <w:numPr>
           <w:ilvl w:val="0"/>
-          <w:numId w:val="1032"/>
+          <w:numId w:val="1039"/>
         </w:numPr>
       </w:pPr>
       <w:r>
@@ -2304,7 +2645,7 @@
         <w:pStyle w:val="Compact"/>
         <w:numPr>
           <w:ilvl w:val="0"/>
-          <w:numId w:val="1032"/>
+          <w:numId w:val="1039"/>
         </w:numPr>
       </w:pPr>
       <w:r>
@@ -2326,7 +2667,7 @@
         <w:pStyle w:val="Compact"/>
         <w:numPr>
           <w:ilvl w:val="0"/>
-          <w:numId w:val="1032"/>
+          <w:numId w:val="1039"/>
         </w:numPr>
       </w:pPr>
       <w:r>
@@ -2348,7 +2689,7 @@
         <w:pStyle w:val="Compact"/>
         <w:numPr>
           <w:ilvl w:val="0"/>
-          <w:numId w:val="1032"/>
+          <w:numId w:val="1039"/>
         </w:numPr>
       </w:pPr>
       <w:r>
@@ -2386,7 +2727,7 @@
         <w:pStyle w:val="Compact"/>
         <w:numPr>
           <w:ilvl w:val="0"/>
-          <w:numId w:val="1032"/>
+          <w:numId w:val="1039"/>
         </w:numPr>
       </w:pPr>
       <w:r>
@@ -2408,7 +2749,7 @@
         <w:pStyle w:val="Compact"/>
         <w:numPr>
           <w:ilvl w:val="0"/>
-          <w:numId w:val="1032"/>
+          <w:numId w:val="1039"/>
         </w:numPr>
       </w:pPr>
       <w:r>
@@ -2432,9 +2773,9 @@
         </w:pict>
       </w:r>
     </w:p>
-    <w:bookmarkEnd w:id="17"/>
-    <w:bookmarkEnd w:id="18"/>
-    <w:bookmarkStart w:id="19" w:name="quick-command-reference-frontend"/>
+    <w:bookmarkEnd w:id="20"/>
+    <w:bookmarkEnd w:id="21"/>
+    <w:bookmarkStart w:id="22" w:name="quick-command-reference-frontend"/>
     <w:p>
       <w:pPr>
         <w:pStyle w:val="Heading2"/>
@@ -2802,8 +3143,8 @@
         </w:pict>
       </w:r>
     </w:p>
-    <w:bookmarkEnd w:id="19"/>
-    <w:bookmarkStart w:id="20" w:name="the-one-thing-that-matters-most"/>
+    <w:bookmarkEnd w:id="22"/>
+    <w:bookmarkStart w:id="23" w:name="the-one-thing-that-matters-most"/>
     <w:p>
       <w:pPr>
         <w:pStyle w:val="Heading2"/>
@@ -2852,8 +3193,8 @@
         <w:t xml:space="preserve">before you scale paid. Everything else compounds off those two moves.</w:t>
       </w:r>
     </w:p>
-    <w:bookmarkEnd w:id="20"/>
-    <w:bookmarkEnd w:id="21"/>
+    <w:bookmarkEnd w:id="23"/>
+    <w:bookmarkEnd w:id="24"/>
     <w:sectPr>
       <w:footnotePr>
         <w:numRestart w:val="eachSect"/>
@@ -3352,6 +3693,27 @@
     <w:abstractNumId w:val="992"/>
   </w:num>
   <w:num w:numId="1032">
+    <w:abstractNumId w:val="992"/>
+  </w:num>
+  <w:num w:numId="1033">
+    <w:abstractNumId w:val="992"/>
+  </w:num>
+  <w:num w:numId="1034">
+    <w:abstractNumId w:val="992"/>
+  </w:num>
+  <w:num w:numId="1035">
+    <w:abstractNumId w:val="992"/>
+  </w:num>
+  <w:num w:numId="1036">
+    <w:abstractNumId w:val="992"/>
+  </w:num>
+  <w:num w:numId="1037">
+    <w:abstractNumId w:val="992"/>
+  </w:num>
+  <w:num w:numId="1038">
+    <w:abstractNumId w:val="992"/>
+  </w:num>
+  <w:num w:numId="1039">
     <w:abstractNumId w:val="99411"/>
     <w:lvlOverride w:ilvl="0">
       <w:startOverride w:val="1"/>

</xml_diff>